<commit_message>
Refactor Socio model and related entities; add GDPR consent handling and update relationships
</commit_message>
<xml_diff>
--- a/doc/Casos de uso/Casos_de_Uso_Gent_Gran.docx
+++ b/doc/Casos de uso/Casos_de_Uso_Gent_Gran.docx
@@ -68,7 +68,31 @@
         <w:rPr>
           <w:lang w:val="es-ES"/>
         </w:rPr>
-        <w:t>Crear un nuevo socio con todos sus datos personales, grupo de difusión, observaciones y cursos asignados.</w:t>
+        <w:t xml:space="preserve">Crear un nuevo socio con todos sus datos personales, grupo de difusión, observaciones y </w:t>
+      </w:r>
+      <w:r>
+        <w:rPr>
+          <w:lang w:val="es-ES"/>
+        </w:rPr>
+        <w:t>actividades</w:t>
+      </w:r>
+      <w:r>
+        <w:rPr>
+          <w:lang w:val="es-ES"/>
+        </w:rPr>
+        <w:t xml:space="preserve"> asignad</w:t>
+      </w:r>
+      <w:r>
+        <w:rPr>
+          <w:lang w:val="es-ES"/>
+        </w:rPr>
+        <w:t>a</w:t>
+      </w:r>
+      <w:r>
+        <w:rPr>
+          <w:lang w:val="es-ES"/>
+        </w:rPr>
+        <w:t>s.</w:t>
       </w:r>
     </w:p>
     <w:p>
@@ -327,6 +351,18 @@
         </w:rPr>
         <w:t>2. Gestión de Voluntarios</w:t>
       </w:r>
+      <w:r>
+        <w:rPr>
+          <w:lang w:val="es-ES"/>
+        </w:rPr>
+        <w:t xml:space="preserve"> y </w:t>
+      </w:r>
+      <w:r>
+        <w:rPr>
+          <w:lang w:val="es-ES"/>
+        </w:rPr>
+        <w:t>Profesores</w:t>
+      </w:r>
     </w:p>
     <w:p>
       <w:pPr>
@@ -335,6 +371,8 @@
           <w:lang w:val="es-ES"/>
         </w:rPr>
       </w:pPr>
+      <w:bookmarkStart w:id="0" w:name="OLE_LINK3"/>
+      <w:bookmarkStart w:id="1" w:name="OLE_LINK4"/>
       <w:r>
         <w:rPr>
           <w:lang w:val="es-ES"/>
@@ -448,7 +486,19 @@
         <w:rPr>
           <w:lang w:val="es-ES"/>
         </w:rPr>
-        <w:t>CU15 – Asignar voluntario a cursos como monitor</w:t>
+        <w:t xml:space="preserve">CU15 – Asignar voluntario a </w:t>
+      </w:r>
+      <w:r>
+        <w:rPr>
+          <w:lang w:val="es-ES"/>
+        </w:rPr>
+        <w:t>actividades</w:t>
+      </w:r>
+      <w:r>
+        <w:rPr>
+          <w:lang w:val="es-ES"/>
+        </w:rPr>
+        <w:t xml:space="preserve"> como monitor</w:t>
       </w:r>
     </w:p>
     <w:p>
@@ -461,7 +511,19 @@
         <w:rPr>
           <w:lang w:val="es-ES"/>
         </w:rPr>
-        <w:t>Asociar uno o más cursos al voluntario.</w:t>
+        <w:t xml:space="preserve">Asociar uno o más </w:t>
+      </w:r>
+      <w:r>
+        <w:rPr>
+          <w:lang w:val="es-ES"/>
+        </w:rPr>
+        <w:t>actividades</w:t>
+      </w:r>
+      <w:r>
+        <w:rPr>
+          <w:lang w:val="es-ES"/>
+        </w:rPr>
+        <w:t xml:space="preserve"> al voluntario.</w:t>
       </w:r>
     </w:p>
     <w:p>
@@ -475,7 +537,31 @@
         <w:rPr>
           <w:lang w:val="es-ES"/>
         </w:rPr>
-        <w:t>CU16 – Listar cursos impartidos por voluntario</w:t>
+        <w:t xml:space="preserve">CU16 – Listar </w:t>
+      </w:r>
+      <w:r>
+        <w:rPr>
+          <w:lang w:val="es-ES"/>
+        </w:rPr>
+        <w:t>actividades</w:t>
+      </w:r>
+      <w:r>
+        <w:rPr>
+          <w:lang w:val="es-ES"/>
+        </w:rPr>
+        <w:t xml:space="preserve"> </w:t>
+      </w:r>
+      <w:r>
+        <w:rPr>
+          <w:lang w:val="es-ES"/>
+        </w:rPr>
+        <w:t>impartidas</w:t>
+      </w:r>
+      <w:r>
+        <w:rPr>
+          <w:lang w:val="es-ES"/>
+        </w:rPr>
+        <w:t xml:space="preserve"> por voluntario</w:t>
       </w:r>
     </w:p>
     <w:p>
@@ -488,170 +574,433 @@
         <w:rPr>
           <w:lang w:val="es-ES"/>
         </w:rPr>
-        <w:t>Ver qué cursos ha impartido un voluntario concreto.</w:t>
+        <w:t xml:space="preserve">Ver qué </w:t>
+      </w:r>
+      <w:r>
+        <w:rPr>
+          <w:lang w:val="es-ES"/>
+        </w:rPr>
+        <w:t>actividades</w:t>
+      </w:r>
+      <w:r>
+        <w:rPr>
+          <w:lang w:val="es-ES"/>
+        </w:rPr>
+        <w:t xml:space="preserve"> ha impartido un voluntario concreto.</w:t>
       </w:r>
     </w:p>
     <w:p>
       <w:pPr>
-        <w:pStyle w:val="Ttulo1"/>
-        <w:rPr>
-          <w:lang w:val="es-ES"/>
-        </w:rPr>
-      </w:pPr>
-      <w:r>
-        <w:rPr>
-          <w:lang w:val="es-ES"/>
-        </w:rPr>
-        <w:t>3. Gestión de Cursos</w:t>
+        <w:pStyle w:val="Ttulo2"/>
+        <w:rPr>
+          <w:lang w:val="es-ES"/>
+        </w:rPr>
+      </w:pPr>
+      <w:r>
+        <w:rPr>
+          <w:lang w:val="es-ES"/>
+        </w:rPr>
+        <w:t>CU11</w:t>
+      </w:r>
+      <w:r>
+        <w:rPr>
+          <w:lang w:val="es-ES"/>
+        </w:rPr>
+        <w:t>b</w:t>
+      </w:r>
+      <w:r>
+        <w:rPr>
+          <w:lang w:val="es-ES"/>
+        </w:rPr>
+        <w:t xml:space="preserve"> – Registrar </w:t>
+      </w:r>
+      <w:r>
+        <w:rPr>
+          <w:lang w:val="es-ES"/>
+        </w:rPr>
+        <w:t>profesor</w:t>
       </w:r>
     </w:p>
     <w:p>
       <w:pPr>
-        <w:pStyle w:val="Ttulo2"/>
-        <w:rPr>
-          <w:lang w:val="es-ES"/>
-        </w:rPr>
-      </w:pPr>
-      <w:r>
-        <w:rPr>
-          <w:lang w:val="es-ES"/>
-        </w:rPr>
-        <w:t>CU17 – Crear curso</w:t>
+        <w:rPr>
+          <w:lang w:val="es-ES"/>
+        </w:rPr>
+      </w:pPr>
+      <w:r>
+        <w:rPr>
+          <w:lang w:val="es-ES"/>
+        </w:rPr>
+        <w:t>Crear una nueva ficha de</w:t>
+      </w:r>
+      <w:r>
+        <w:rPr>
+          <w:lang w:val="es-ES"/>
+        </w:rPr>
+        <w:t xml:space="preserve"> </w:t>
+      </w:r>
+      <w:r>
+        <w:rPr>
+          <w:lang w:val="es-ES"/>
+        </w:rPr>
+        <w:t>profesor</w:t>
+      </w:r>
+      <w:r>
+        <w:rPr>
+          <w:lang w:val="es-ES"/>
+        </w:rPr>
+        <w:t xml:space="preserve"> con datos personales.</w:t>
       </w:r>
     </w:p>
     <w:p>
       <w:pPr>
-        <w:rPr>
-          <w:lang w:val="es-ES"/>
-        </w:rPr>
-      </w:pPr>
-      <w:r>
-        <w:rPr>
-          <w:lang w:val="es-ES"/>
-        </w:rPr>
-        <w:t>Crear una nueva actividad o curso con fecha, temática y monitor.</w:t>
+        <w:pStyle w:val="Ttulo2"/>
+        <w:rPr>
+          <w:lang w:val="es-ES"/>
+        </w:rPr>
+      </w:pPr>
+      <w:r>
+        <w:rPr>
+          <w:lang w:val="es-ES"/>
+        </w:rPr>
+        <w:t>CU12</w:t>
+      </w:r>
+      <w:r>
+        <w:rPr>
+          <w:lang w:val="es-ES"/>
+        </w:rPr>
+        <w:t>b</w:t>
+      </w:r>
+      <w:r>
+        <w:rPr>
+          <w:lang w:val="es-ES"/>
+        </w:rPr>
+        <w:t xml:space="preserve"> – Modificar </w:t>
+      </w:r>
+      <w:r>
+        <w:rPr>
+          <w:lang w:val="es-ES"/>
+        </w:rPr>
+        <w:t>profesor</w:t>
       </w:r>
     </w:p>
     <w:p>
       <w:pPr>
-        <w:pStyle w:val="Ttulo2"/>
-        <w:rPr>
-          <w:lang w:val="es-ES"/>
-        </w:rPr>
-      </w:pPr>
-      <w:r>
-        <w:rPr>
-          <w:lang w:val="es-ES"/>
-        </w:rPr>
-        <w:t>CU18 – Modificar curso</w:t>
+        <w:rPr>
+          <w:lang w:val="es-ES"/>
+        </w:rPr>
+      </w:pPr>
+      <w:r>
+        <w:rPr>
+          <w:lang w:val="es-ES"/>
+        </w:rPr>
+        <w:t xml:space="preserve">Editar la información del </w:t>
+      </w:r>
+      <w:r>
+        <w:rPr>
+          <w:lang w:val="es-ES"/>
+        </w:rPr>
+        <w:t>profesor</w:t>
+      </w:r>
+      <w:r>
+        <w:rPr>
+          <w:lang w:val="es-ES"/>
+        </w:rPr>
+        <w:t>.</w:t>
       </w:r>
     </w:p>
     <w:p>
       <w:pPr>
-        <w:rPr>
-          <w:lang w:val="es-ES"/>
-        </w:rPr>
-      </w:pPr>
-      <w:r>
-        <w:rPr>
-          <w:lang w:val="es-ES"/>
-        </w:rPr>
-        <w:t>Cambiar datos del curso (horario, monitor, descripción).</w:t>
+        <w:pStyle w:val="Ttulo2"/>
+        <w:rPr>
+          <w:lang w:val="es-ES"/>
+        </w:rPr>
+      </w:pPr>
+      <w:r>
+        <w:rPr>
+          <w:lang w:val="es-ES"/>
+        </w:rPr>
+        <w:t>CU13</w:t>
+      </w:r>
+      <w:r>
+        <w:rPr>
+          <w:lang w:val="es-ES"/>
+        </w:rPr>
+        <w:t>b</w:t>
+      </w:r>
+      <w:r>
+        <w:rPr>
+          <w:lang w:val="es-ES"/>
+        </w:rPr>
+        <w:t xml:space="preserve"> – Eliminar </w:t>
+      </w:r>
+      <w:r>
+        <w:rPr>
+          <w:lang w:val="es-ES"/>
+        </w:rPr>
+        <w:t>profesor</w:t>
       </w:r>
     </w:p>
     <w:p>
       <w:pPr>
-        <w:pStyle w:val="Ttulo2"/>
-        <w:rPr>
-          <w:lang w:val="es-ES"/>
-        </w:rPr>
-      </w:pPr>
-      <w:r>
-        <w:rPr>
-          <w:lang w:val="es-ES"/>
-        </w:rPr>
-        <w:t>CU19 – Eliminar curso</w:t>
+        <w:rPr>
+          <w:lang w:val="es-ES"/>
+        </w:rPr>
+      </w:pPr>
+      <w:r>
+        <w:rPr>
+          <w:lang w:val="es-ES"/>
+        </w:rPr>
+        <w:t xml:space="preserve">Eliminar un </w:t>
+      </w:r>
+      <w:r>
+        <w:rPr>
+          <w:lang w:val="es-ES"/>
+        </w:rPr>
+        <w:t>profesor</w:t>
+      </w:r>
+      <w:r>
+        <w:rPr>
+          <w:lang w:val="es-ES"/>
+        </w:rPr>
+        <w:t xml:space="preserve"> del sistema.</w:t>
       </w:r>
     </w:p>
     <w:p>
       <w:pPr>
-        <w:rPr>
-          <w:lang w:val="es-ES"/>
-        </w:rPr>
-      </w:pPr>
-      <w:r>
-        <w:rPr>
-          <w:lang w:val="es-ES"/>
-        </w:rPr>
-        <w:t>Eliminar un curso del sistema.</w:t>
+        <w:pStyle w:val="Ttulo2"/>
+        <w:rPr>
+          <w:lang w:val="es-ES"/>
+        </w:rPr>
+      </w:pPr>
+      <w:r>
+        <w:rPr>
+          <w:lang w:val="es-ES"/>
+        </w:rPr>
+        <w:t>CU14</w:t>
+      </w:r>
+      <w:r>
+        <w:rPr>
+          <w:lang w:val="es-ES"/>
+        </w:rPr>
+        <w:t>b</w:t>
+      </w:r>
+      <w:r>
+        <w:rPr>
+          <w:lang w:val="es-ES"/>
+        </w:rPr>
+        <w:t xml:space="preserve"> – Consultar </w:t>
+      </w:r>
+      <w:r>
+        <w:rPr>
+          <w:lang w:val="es-ES"/>
+        </w:rPr>
+        <w:t>profesor</w:t>
       </w:r>
     </w:p>
     <w:p>
       <w:pPr>
-        <w:pStyle w:val="Ttulo2"/>
-        <w:rPr>
-          <w:lang w:val="es-ES"/>
-        </w:rPr>
-      </w:pPr>
-      <w:r>
-        <w:rPr>
-          <w:lang w:val="es-ES"/>
-        </w:rPr>
-        <w:t>CU20 – Consultar curso</w:t>
+        <w:rPr>
+          <w:lang w:val="es-ES"/>
+        </w:rPr>
+      </w:pPr>
+      <w:r>
+        <w:rPr>
+          <w:lang w:val="es-ES"/>
+        </w:rPr>
+        <w:t xml:space="preserve">Ver los datos del </w:t>
+      </w:r>
+      <w:r>
+        <w:rPr>
+          <w:lang w:val="es-ES"/>
+        </w:rPr>
+        <w:t>profesor</w:t>
+      </w:r>
+      <w:r>
+        <w:rPr>
+          <w:lang w:val="es-ES"/>
+        </w:rPr>
+        <w:t>.</w:t>
       </w:r>
     </w:p>
     <w:p>
       <w:pPr>
-        <w:rPr>
-          <w:lang w:val="es-ES"/>
-        </w:rPr>
-      </w:pPr>
-      <w:r>
-        <w:rPr>
-          <w:lang w:val="es-ES"/>
-        </w:rPr>
-        <w:t>Ver toda la información de un curso.</w:t>
+        <w:pStyle w:val="Ttulo2"/>
+        <w:rPr>
+          <w:lang w:val="es-ES"/>
+        </w:rPr>
+      </w:pPr>
+      <w:r>
+        <w:rPr>
+          <w:lang w:val="es-ES"/>
+        </w:rPr>
+        <w:t>CU15</w:t>
+      </w:r>
+      <w:r>
+        <w:rPr>
+          <w:lang w:val="es-ES"/>
+        </w:rPr>
+        <w:t>b</w:t>
+      </w:r>
+      <w:r>
+        <w:rPr>
+          <w:lang w:val="es-ES"/>
+        </w:rPr>
+        <w:t xml:space="preserve"> – Asignar </w:t>
+      </w:r>
+      <w:r>
+        <w:rPr>
+          <w:lang w:val="es-ES"/>
+        </w:rPr>
+        <w:t>profesor</w:t>
+      </w:r>
+      <w:r>
+        <w:rPr>
+          <w:lang w:val="es-ES"/>
+        </w:rPr>
+        <w:t xml:space="preserve"> a </w:t>
+      </w:r>
+      <w:r>
+        <w:rPr>
+          <w:lang w:val="es-ES"/>
+        </w:rPr>
+        <w:t>actividades</w:t>
+      </w:r>
+      <w:r>
+        <w:rPr>
+          <w:lang w:val="es-ES"/>
+        </w:rPr>
+        <w:t xml:space="preserve"> como monitor</w:t>
       </w:r>
     </w:p>
     <w:p>
       <w:pPr>
-        <w:pStyle w:val="Ttulo2"/>
-        <w:rPr>
-          <w:lang w:val="es-ES"/>
-        </w:rPr>
-      </w:pPr>
-      <w:r>
-        <w:rPr>
-          <w:lang w:val="es-ES"/>
-        </w:rPr>
-        <w:t>CU21 – Inscribir socio en curso</w:t>
+        <w:rPr>
+          <w:lang w:val="es-ES"/>
+        </w:rPr>
+      </w:pPr>
+      <w:r>
+        <w:rPr>
+          <w:lang w:val="es-ES"/>
+        </w:rPr>
+        <w:t xml:space="preserve">Asociar uno o más </w:t>
+      </w:r>
+      <w:r>
+        <w:rPr>
+          <w:lang w:val="es-ES"/>
+        </w:rPr>
+        <w:t>actividades</w:t>
+      </w:r>
+      <w:r>
+        <w:rPr>
+          <w:lang w:val="es-ES"/>
+        </w:rPr>
+        <w:t xml:space="preserve"> al </w:t>
+      </w:r>
+      <w:r>
+        <w:rPr>
+          <w:lang w:val="es-ES"/>
+        </w:rPr>
+        <w:t>profesor</w:t>
+      </w:r>
+      <w:r>
+        <w:rPr>
+          <w:lang w:val="es-ES"/>
+        </w:rPr>
+        <w:t>.</w:t>
       </w:r>
     </w:p>
     <w:p>
       <w:pPr>
-        <w:rPr>
-          <w:lang w:val="es-ES"/>
-        </w:rPr>
-      </w:pPr>
-      <w:r>
-        <w:rPr>
-          <w:lang w:val="es-ES"/>
-        </w:rPr>
-        <w:t>Añadir un socio como participante a un curso.</w:t>
+        <w:pStyle w:val="Ttulo2"/>
+        <w:rPr>
+          <w:lang w:val="es-ES"/>
+        </w:rPr>
+      </w:pPr>
+      <w:r>
+        <w:rPr>
+          <w:lang w:val="es-ES"/>
+        </w:rPr>
+        <w:t>CU16</w:t>
+      </w:r>
+      <w:r>
+        <w:rPr>
+          <w:lang w:val="es-ES"/>
+        </w:rPr>
+        <w:t>b</w:t>
+      </w:r>
+      <w:r>
+        <w:rPr>
+          <w:lang w:val="es-ES"/>
+        </w:rPr>
+        <w:t xml:space="preserve"> – Listar </w:t>
+      </w:r>
+      <w:r>
+        <w:rPr>
+          <w:lang w:val="es-ES"/>
+        </w:rPr>
+        <w:t>actividades</w:t>
+      </w:r>
+      <w:r>
+        <w:rPr>
+          <w:lang w:val="es-ES"/>
+        </w:rPr>
+        <w:t xml:space="preserve"> </w:t>
+      </w:r>
+      <w:r>
+        <w:rPr>
+          <w:lang w:val="es-ES"/>
+        </w:rPr>
+        <w:t>impartidas</w:t>
+      </w:r>
+      <w:r>
+        <w:rPr>
+          <w:lang w:val="es-ES"/>
+        </w:rPr>
+        <w:t xml:space="preserve"> por </w:t>
+      </w:r>
+      <w:r>
+        <w:rPr>
+          <w:lang w:val="es-ES"/>
+        </w:rPr>
+        <w:t>profesor</w:t>
       </w:r>
     </w:p>
     <w:p>
       <w:pPr>
-        <w:pStyle w:val="Ttulo2"/>
-        <w:rPr>
-          <w:lang w:val="es-ES"/>
-        </w:rPr>
-      </w:pPr>
-      <w:r>
-        <w:rPr>
-          <w:lang w:val="es-ES"/>
-        </w:rPr>
-        <w:t>CU22 – Modificar participantes del curso</w:t>
+        <w:rPr>
+          <w:lang w:val="es-ES"/>
+        </w:rPr>
+      </w:pPr>
+      <w:r>
+        <w:rPr>
+          <w:lang w:val="es-ES"/>
+        </w:rPr>
+        <w:t xml:space="preserve">Ver qué </w:t>
+      </w:r>
+      <w:r>
+        <w:rPr>
+          <w:lang w:val="es-ES"/>
+        </w:rPr>
+        <w:t>actividades</w:t>
+      </w:r>
+      <w:r>
+        <w:rPr>
+          <w:lang w:val="es-ES"/>
+        </w:rPr>
+        <w:t xml:space="preserve"> ha impartido un </w:t>
+      </w:r>
+      <w:r>
+        <w:rPr>
+          <w:lang w:val="es-ES"/>
+        </w:rPr>
+        <w:t>profesor</w:t>
+      </w:r>
+      <w:r>
+        <w:rPr>
+          <w:lang w:val="es-ES"/>
+        </w:rPr>
+        <w:t xml:space="preserve"> concreto.</w:t>
       </w:r>
     </w:p>
     <w:p>
@@ -660,511 +1009,27 @@
           <w:lang w:val="es-ES"/>
         </w:rPr>
       </w:pPr>
-      <w:r>
-        <w:rPr>
-          <w:lang w:val="es-ES"/>
-        </w:rPr>
-        <w:t>Añadir o eliminar socios inscritos a un curso.</w:t>
-      </w:r>
-    </w:p>
-    <w:p>
-      <w:pPr>
-        <w:pStyle w:val="Ttulo2"/>
-        <w:rPr>
-          <w:lang w:val="es-ES"/>
-        </w:rPr>
-      </w:pPr>
-      <w:r>
-        <w:rPr>
-          <w:lang w:val="es-ES"/>
-        </w:rPr>
-        <w:t>CU23 – Listar participantes de un curso</w:t>
-      </w:r>
-    </w:p>
-    <w:p>
-      <w:pPr>
-        <w:rPr>
-          <w:lang w:val="es-ES"/>
-        </w:rPr>
-      </w:pPr>
-      <w:r>
-        <w:rPr>
-          <w:lang w:val="es-ES"/>
-        </w:rPr>
-        <w:t>Ver el listado de socios apuntados a una actividad.</w:t>
-      </w:r>
-    </w:p>
-    <w:p>
-      <w:pPr>
-        <w:pStyle w:val="Ttulo1"/>
-        <w:rPr>
-          <w:lang w:val="es-ES"/>
-        </w:rPr>
-      </w:pPr>
-      <w:r>
-        <w:rPr>
-          <w:lang w:val="es-ES"/>
-        </w:rPr>
-        <w:t>4. Gestión de Asistencia</w:t>
-      </w:r>
-    </w:p>
-    <w:p>
-      <w:pPr>
-        <w:pStyle w:val="Ttulo2"/>
-        <w:rPr>
-          <w:lang w:val="es-ES"/>
-        </w:rPr>
-      </w:pPr>
-      <w:r>
-        <w:rPr>
-          <w:lang w:val="es-ES"/>
-        </w:rPr>
-        <w:t>CU24 – Registrar asistencia de socios</w:t>
-      </w:r>
-    </w:p>
-    <w:p>
-      <w:pPr>
-        <w:rPr>
-          <w:lang w:val="es-ES"/>
-        </w:rPr>
-      </w:pPr>
-      <w:r>
-        <w:rPr>
-          <w:lang w:val="es-ES"/>
-        </w:rPr>
-        <w:t>Marcar la presencia o ausencia de socios en sesiones del curso.</w:t>
-      </w:r>
-    </w:p>
-    <w:p>
-      <w:pPr>
-        <w:pStyle w:val="Ttulo2"/>
-        <w:rPr>
-          <w:lang w:val="es-ES"/>
-        </w:rPr>
-      </w:pPr>
-      <w:r>
-        <w:rPr>
-          <w:lang w:val="es-ES"/>
-        </w:rPr>
-        <w:lastRenderedPageBreak/>
-        <w:t>CU25 – Modificar asistencia</w:t>
-      </w:r>
-    </w:p>
-    <w:p>
-      <w:pPr>
-        <w:rPr>
-          <w:lang w:val="es-ES"/>
-        </w:rPr>
-      </w:pPr>
-      <w:r>
-        <w:rPr>
-          <w:lang w:val="es-ES"/>
-        </w:rPr>
-        <w:t>Corregir errores en el registro de asistencia.</w:t>
-      </w:r>
-    </w:p>
-    <w:p>
-      <w:pPr>
-        <w:pStyle w:val="Ttulo2"/>
-        <w:rPr>
-          <w:lang w:val="es-ES"/>
-        </w:rPr>
-      </w:pPr>
-      <w:r>
-        <w:rPr>
-          <w:lang w:val="es-ES"/>
-        </w:rPr>
-        <w:t>CU26 – Consultar asistencia de un socio</w:t>
-      </w:r>
-    </w:p>
-    <w:p>
-      <w:pPr>
-        <w:rPr>
-          <w:lang w:val="es-ES"/>
-        </w:rPr>
-      </w:pPr>
-      <w:r>
-        <w:rPr>
-          <w:lang w:val="es-ES"/>
-        </w:rPr>
-        <w:t>Ver las asistencias del socio por curso.</w:t>
-      </w:r>
-    </w:p>
-    <w:p>
-      <w:pPr>
-        <w:pStyle w:val="Ttulo2"/>
-        <w:rPr>
-          <w:lang w:val="es-ES"/>
-        </w:rPr>
-      </w:pPr>
-      <w:r>
-        <w:rPr>
-          <w:lang w:val="es-ES"/>
-        </w:rPr>
-        <w:t>CU27 – Generar informe de asistencia</w:t>
-      </w:r>
-    </w:p>
-    <w:p>
-      <w:pPr>
-        <w:rPr>
-          <w:lang w:val="es-ES"/>
-        </w:rPr>
-      </w:pPr>
-      <w:r>
-        <w:rPr>
-          <w:lang w:val="es-ES"/>
-        </w:rPr>
-        <w:t>Crear un informe con resumen porcentual y fechas de asistencia.</w:t>
-      </w:r>
-    </w:p>
-    <w:p>
-      <w:pPr>
-        <w:pStyle w:val="Ttulo1"/>
-        <w:rPr>
-          <w:lang w:val="es-ES"/>
-        </w:rPr>
-      </w:pPr>
-      <w:r>
-        <w:rPr>
-          <w:lang w:val="es-ES"/>
-        </w:rPr>
-        <w:t>5. Gestión de Pagos</w:t>
-      </w:r>
-    </w:p>
-    <w:p>
-      <w:pPr>
-        <w:pStyle w:val="Ttulo2"/>
-        <w:rPr>
-          <w:lang w:val="es-ES"/>
-        </w:rPr>
-      </w:pPr>
-      <w:r>
-        <w:rPr>
-          <w:lang w:val="es-ES"/>
-        </w:rPr>
-        <w:t>CU28 – Registrar pago</w:t>
-      </w:r>
-    </w:p>
-    <w:p>
-      <w:pPr>
-        <w:rPr>
-          <w:lang w:val="es-ES"/>
-        </w:rPr>
-      </w:pPr>
-      <w:r>
-        <w:rPr>
-          <w:lang w:val="es-ES"/>
-        </w:rPr>
-        <w:t>Registrar un pago de un socio por la inscripción a un curso.</w:t>
-      </w:r>
-    </w:p>
-    <w:p>
-      <w:pPr>
-        <w:pStyle w:val="Ttulo2"/>
-        <w:rPr>
-          <w:lang w:val="es-ES"/>
-        </w:rPr>
-      </w:pPr>
-      <w:r>
-        <w:rPr>
-          <w:lang w:val="es-ES"/>
-        </w:rPr>
-        <w:t>CU29 – Modificar pago</w:t>
-      </w:r>
-    </w:p>
-    <w:p>
-      <w:pPr>
-        <w:rPr>
-          <w:lang w:val="es-ES"/>
-        </w:rPr>
-      </w:pPr>
-      <w:r>
-        <w:rPr>
-          <w:lang w:val="es-ES"/>
-        </w:rPr>
-        <w:t>Cambiar la cantidad, fecha u observaciones de un pago.</w:t>
-      </w:r>
-    </w:p>
-    <w:p>
-      <w:pPr>
-        <w:pStyle w:val="Ttulo2"/>
-        <w:rPr>
-          <w:lang w:val="es-ES"/>
-        </w:rPr>
-      </w:pPr>
-      <w:r>
-        <w:rPr>
-          <w:lang w:val="es-ES"/>
-        </w:rPr>
-        <w:t>CU30 – Eliminar pago</w:t>
-      </w:r>
-    </w:p>
-    <w:p>
-      <w:pPr>
-        <w:rPr>
-          <w:lang w:val="es-ES"/>
-        </w:rPr>
-      </w:pPr>
-      <w:r>
-        <w:rPr>
-          <w:lang w:val="es-ES"/>
-        </w:rPr>
-        <w:t>Eliminar un registro de pago.</w:t>
-      </w:r>
-    </w:p>
-    <w:p>
-      <w:pPr>
-        <w:pStyle w:val="Ttulo2"/>
-        <w:rPr>
-          <w:lang w:val="es-ES"/>
-        </w:rPr>
-      </w:pPr>
-      <w:r>
-        <w:rPr>
-          <w:lang w:val="es-ES"/>
-        </w:rPr>
-        <w:t>CU31 – Consultar pagos de un socio</w:t>
-      </w:r>
-    </w:p>
-    <w:p>
-      <w:pPr>
-        <w:rPr>
-          <w:lang w:val="es-ES"/>
-        </w:rPr>
-      </w:pPr>
-      <w:r>
-        <w:rPr>
-          <w:lang w:val="es-ES"/>
-        </w:rPr>
-        <w:t>Ver todos los pagos realizados por un socio.</w:t>
-      </w:r>
-    </w:p>
-    <w:p>
-      <w:pPr>
-        <w:pStyle w:val="Ttulo2"/>
-        <w:rPr>
-          <w:lang w:val="es-ES"/>
-        </w:rPr>
-      </w:pPr>
-      <w:r>
-        <w:rPr>
-          <w:lang w:val="es-ES"/>
-        </w:rPr>
-        <w:t>CU32 – Consultar pagos de una actividad</w:t>
-      </w:r>
-    </w:p>
-    <w:p>
-      <w:pPr>
-        <w:rPr>
-          <w:lang w:val="es-ES"/>
-        </w:rPr>
-      </w:pPr>
-      <w:r>
-        <w:rPr>
-          <w:lang w:val="es-ES"/>
-        </w:rPr>
-        <w:t>Ver los pagos recibidos para un curso específico.</w:t>
-      </w:r>
-    </w:p>
-    <w:p>
-      <w:pPr>
-        <w:pStyle w:val="Ttulo1"/>
-        <w:rPr>
-          <w:lang w:val="es-ES"/>
-        </w:rPr>
-      </w:pPr>
-      <w:r>
-        <w:rPr>
-          <w:lang w:val="es-ES"/>
-        </w:rPr>
-        <w:t>6. Importación y Exportación</w:t>
-      </w:r>
-    </w:p>
-    <w:p>
-      <w:pPr>
-        <w:pStyle w:val="Ttulo2"/>
-        <w:rPr>
-          <w:lang w:val="es-ES"/>
-        </w:rPr>
-      </w:pPr>
-      <w:r>
-        <w:rPr>
-          <w:lang w:val="es-ES"/>
-        </w:rPr>
-        <w:t>CU33 – Importar datos desde Excel</w:t>
-      </w:r>
-    </w:p>
-    <w:p>
-      <w:pPr>
-        <w:rPr>
-          <w:lang w:val="es-ES"/>
-        </w:rPr>
-      </w:pPr>
-      <w:r>
-        <w:rPr>
-          <w:lang w:val="es-ES"/>
-        </w:rPr>
-        <w:t>Cargar socios, voluntarios o cursos desde archivo Excel.</w:t>
-      </w:r>
-    </w:p>
-    <w:p>
-      <w:pPr>
-        <w:pStyle w:val="Ttulo2"/>
-        <w:rPr>
-          <w:lang w:val="es-ES"/>
-        </w:rPr>
-      </w:pPr>
-      <w:r>
-        <w:rPr>
-          <w:lang w:val="es-ES"/>
-        </w:rPr>
-        <w:t>CU34 – Exportar listados a Excel</w:t>
-      </w:r>
-    </w:p>
-    <w:p>
-      <w:pPr>
-        <w:rPr>
-          <w:lang w:val="es-ES"/>
-        </w:rPr>
-      </w:pPr>
-      <w:r>
-        <w:rPr>
-          <w:lang w:val="es-ES"/>
-        </w:rPr>
-        <w:t>Generar Excel con listados de socios, cursos, pagos, asistencia, etc.</w:t>
-      </w:r>
-    </w:p>
-    <w:p>
-      <w:pPr>
-        <w:pStyle w:val="Ttulo1"/>
-        <w:rPr>
-          <w:lang w:val="es-ES"/>
-        </w:rPr>
-      </w:pPr>
-      <w:r>
-        <w:rPr>
-          <w:lang w:val="es-ES"/>
-        </w:rPr>
-        <w:t>7. Generación de Informes</w:t>
-      </w:r>
-    </w:p>
-    <w:p>
-      <w:pPr>
-        <w:pStyle w:val="Ttulo2"/>
-        <w:rPr>
-          <w:lang w:val="es-ES"/>
-        </w:rPr>
-      </w:pPr>
-      <w:r>
-        <w:rPr>
-          <w:lang w:val="es-ES"/>
-        </w:rPr>
-        <w:t>CU35 – Generar informe de socios</w:t>
-      </w:r>
-    </w:p>
-    <w:p>
-      <w:pPr>
-        <w:rPr>
-          <w:lang w:val="es-ES"/>
-        </w:rPr>
-      </w:pPr>
-      <w:r>
-        <w:rPr>
-          <w:lang w:val="es-ES"/>
-        </w:rPr>
-        <w:t>Exportar todos los datos de socios activos o dados de baja.</w:t>
-      </w:r>
-    </w:p>
-    <w:p>
-      <w:pPr>
-        <w:pStyle w:val="Ttulo2"/>
-        <w:rPr>
-          <w:lang w:val="es-ES"/>
-        </w:rPr>
-      </w:pPr>
-      <w:r>
-        <w:rPr>
-          <w:lang w:val="es-ES"/>
-        </w:rPr>
-        <w:t>CU36 – Generar informe de actividades</w:t>
-      </w:r>
-    </w:p>
-    <w:p>
-      <w:pPr>
-        <w:rPr>
-          <w:lang w:val="es-ES"/>
-        </w:rPr>
-      </w:pPr>
-      <w:r>
-        <w:rPr>
-          <w:lang w:val="es-ES"/>
-        </w:rPr>
-        <w:t>Listado general de cursos activos y su información.</w:t>
-      </w:r>
-    </w:p>
-    <w:p>
-      <w:pPr>
-        <w:pStyle w:val="Ttulo2"/>
-        <w:rPr>
-          <w:lang w:val="es-ES"/>
-        </w:rPr>
-      </w:pPr>
-      <w:r>
-        <w:rPr>
-          <w:lang w:val="es-ES"/>
-        </w:rPr>
-        <w:lastRenderedPageBreak/>
-        <w:t>CU37 – Generar informe de profesores</w:t>
-      </w:r>
-    </w:p>
-    <w:p>
-      <w:pPr>
-        <w:rPr>
-          <w:lang w:val="es-ES"/>
-        </w:rPr>
-      </w:pPr>
-      <w:r>
-        <w:rPr>
-          <w:lang w:val="es-ES"/>
-        </w:rPr>
-        <w:t>Ver resumen de voluntarios y sus actividades impartidas.</w:t>
-      </w:r>
-    </w:p>
-    <w:p>
-      <w:pPr>
-        <w:pStyle w:val="Ttulo2"/>
-        <w:rPr>
-          <w:lang w:val="es-ES"/>
-        </w:rPr>
-      </w:pPr>
-      <w:bookmarkStart w:id="0" w:name="_Hlk201490768"/>
-      <w:bookmarkStart w:id="1" w:name="OLE_LINK2"/>
-      <w:r>
-        <w:rPr>
-          <w:lang w:val="es-ES"/>
-        </w:rPr>
-        <w:t>CU38 – Generar informe de inscripciones</w:t>
-      </w:r>
     </w:p>
     <w:bookmarkEnd w:id="0"/>
     <w:bookmarkEnd w:id="1"/>
     <w:p>
       <w:pPr>
-        <w:rPr>
-          <w:lang w:val="es-ES"/>
-        </w:rPr>
-      </w:pPr>
-      <w:r>
-        <w:rPr>
-          <w:lang w:val="es-ES"/>
-        </w:rPr>
-        <w:t>Ver qué socios están inscritos en qué cursos.</w:t>
-      </w:r>
-      <w:r>
-        <w:rPr>
-          <w:lang w:val="es-ES"/>
-        </w:rPr>
-        <w:t xml:space="preserve"> Dar opción a ordenar por fecha de inscripción.</w:t>
+        <w:pStyle w:val="Ttulo1"/>
+        <w:rPr>
+          <w:lang w:val="es-ES"/>
+        </w:rPr>
+      </w:pPr>
+      <w:r>
+        <w:rPr>
+          <w:lang w:val="es-ES"/>
+        </w:rPr>
+        <w:t xml:space="preserve">3. Gestión de </w:t>
+      </w:r>
+      <w:r>
+        <w:rPr>
+          <w:lang w:val="es-ES"/>
+        </w:rPr>
+        <w:t>Actividades</w:t>
       </w:r>
     </w:p>
     <w:p>
@@ -1178,7 +1043,13 @@
         <w:rPr>
           <w:lang w:val="es-ES"/>
         </w:rPr>
-        <w:t>CU39 – Generar informe de pagos</w:t>
+        <w:t xml:space="preserve">CU17 – Crear </w:t>
+      </w:r>
+      <w:r>
+        <w:rPr>
+          <w:lang w:val="es-ES"/>
+        </w:rPr>
+        <w:t>actividad</w:t>
       </w:r>
     </w:p>
     <w:p>
@@ -1191,7 +1062,7 @@
         <w:rPr>
           <w:lang w:val="es-ES"/>
         </w:rPr>
-        <w:t>Ver pagos realizados por curso, socio o fecha.</w:t>
+        <w:t>Crear una nueva actividad con fecha, temática y monitor.</w:t>
       </w:r>
     </w:p>
     <w:p>
@@ -1201,18 +1072,17 @@
           <w:lang w:val="es-ES"/>
         </w:rPr>
       </w:pPr>
-      <w:bookmarkStart w:id="2" w:name="OLE_LINK1"/>
-      <w:r>
-        <w:rPr>
-          <w:lang w:val="es-ES"/>
-        </w:rPr>
-        <w:t xml:space="preserve">CU40 – Generar informe de </w:t>
-      </w:r>
-      <w:r>
-        <w:rPr>
-          <w:lang w:val="es-ES"/>
-        </w:rPr>
-        <w:t>asistencia trimestral</w:t>
+      <w:r>
+        <w:rPr>
+          <w:lang w:val="es-ES"/>
+        </w:rPr>
+        <w:t xml:space="preserve">CU18 – Modificar </w:t>
+      </w:r>
+      <w:r>
+        <w:rPr>
+          <w:lang w:val="es-ES"/>
+        </w:rPr>
+        <w:t>actividad</w:t>
       </w:r>
     </w:p>
     <w:p>
@@ -1225,106 +1095,934 @@
         <w:rPr>
           <w:lang w:val="es-ES"/>
         </w:rPr>
-        <w:t>Por cada actividad, poder generar un informe de asistencia trimestral</w:t>
-      </w:r>
-      <w:r>
-        <w:rPr>
-          <w:lang w:val="es-ES"/>
-        </w:rPr>
-        <w:t xml:space="preserve"> de cada alumno.</w:t>
+        <w:t xml:space="preserve">Cambiar datos </w:t>
+      </w:r>
+      <w:r>
+        <w:rPr>
+          <w:lang w:val="es-ES"/>
+        </w:rPr>
+        <w:t>de la actividad</w:t>
+      </w:r>
+      <w:r>
+        <w:rPr>
+          <w:lang w:val="es-ES"/>
+        </w:rPr>
+        <w:t xml:space="preserve"> (horario, monitor, descripción).</w:t>
+      </w:r>
+    </w:p>
+    <w:p>
+      <w:pPr>
+        <w:pStyle w:val="Ttulo2"/>
+        <w:rPr>
+          <w:lang w:val="es-ES"/>
+        </w:rPr>
+      </w:pPr>
+      <w:r>
+        <w:rPr>
+          <w:lang w:val="es-ES"/>
+        </w:rPr>
+        <w:lastRenderedPageBreak/>
+        <w:t xml:space="preserve">CU19 – Eliminar </w:t>
+      </w:r>
+      <w:r>
+        <w:rPr>
+          <w:lang w:val="es-ES"/>
+        </w:rPr>
+        <w:t>actividad</w:t>
+      </w:r>
+    </w:p>
+    <w:p>
+      <w:pPr>
+        <w:rPr>
+          <w:lang w:val="es-ES"/>
+        </w:rPr>
+      </w:pPr>
+      <w:r>
+        <w:rPr>
+          <w:lang w:val="es-ES"/>
+        </w:rPr>
+        <w:t xml:space="preserve">Eliminar </w:t>
+      </w:r>
+      <w:r>
+        <w:rPr>
+          <w:lang w:val="es-ES"/>
+        </w:rPr>
+        <w:t>una actividad</w:t>
+      </w:r>
+      <w:r>
+        <w:rPr>
+          <w:lang w:val="es-ES"/>
+        </w:rPr>
+        <w:t xml:space="preserve"> del sistema.</w:t>
+      </w:r>
+    </w:p>
+    <w:p>
+      <w:pPr>
+        <w:pStyle w:val="Ttulo2"/>
+        <w:rPr>
+          <w:lang w:val="es-ES"/>
+        </w:rPr>
+      </w:pPr>
+      <w:r>
+        <w:rPr>
+          <w:lang w:val="es-ES"/>
+        </w:rPr>
+        <w:t xml:space="preserve">CU20 – Consultar </w:t>
+      </w:r>
+      <w:r>
+        <w:rPr>
+          <w:lang w:val="es-ES"/>
+        </w:rPr>
+        <w:t>actividad</w:t>
+      </w:r>
+    </w:p>
+    <w:p>
+      <w:pPr>
+        <w:rPr>
+          <w:lang w:val="es-ES"/>
+        </w:rPr>
+      </w:pPr>
+      <w:r>
+        <w:rPr>
+          <w:lang w:val="es-ES"/>
+        </w:rPr>
+        <w:t xml:space="preserve">Ver toda la información de </w:t>
+      </w:r>
+      <w:r>
+        <w:rPr>
+          <w:lang w:val="es-ES"/>
+        </w:rPr>
+        <w:t>una actividad</w:t>
+      </w:r>
+      <w:r>
+        <w:rPr>
+          <w:lang w:val="es-ES"/>
+        </w:rPr>
+        <w:t>.</w:t>
+      </w:r>
+    </w:p>
+    <w:p>
+      <w:pPr>
+        <w:pStyle w:val="Ttulo2"/>
+        <w:rPr>
+          <w:lang w:val="es-ES"/>
+        </w:rPr>
+      </w:pPr>
+      <w:r>
+        <w:rPr>
+          <w:lang w:val="es-ES"/>
+        </w:rPr>
+        <w:t xml:space="preserve">CU21 – Inscribir socio en </w:t>
+      </w:r>
+      <w:r>
+        <w:rPr>
+          <w:lang w:val="es-ES"/>
+        </w:rPr>
+        <w:t>actividad</w:t>
+      </w:r>
+    </w:p>
+    <w:p>
+      <w:pPr>
+        <w:rPr>
+          <w:lang w:val="es-ES"/>
+        </w:rPr>
+      </w:pPr>
+      <w:r>
+        <w:rPr>
+          <w:lang w:val="es-ES"/>
+        </w:rPr>
+        <w:t xml:space="preserve">Añadir un socio como participante a </w:t>
+      </w:r>
+      <w:r>
+        <w:rPr>
+          <w:lang w:val="es-ES"/>
+        </w:rPr>
+        <w:t>una actividad</w:t>
+      </w:r>
+      <w:r>
+        <w:rPr>
+          <w:lang w:val="es-ES"/>
+        </w:rPr>
+        <w:t>.</w:t>
+      </w:r>
+    </w:p>
+    <w:p>
+      <w:pPr>
+        <w:pStyle w:val="Ttulo2"/>
+        <w:rPr>
+          <w:lang w:val="es-ES"/>
+        </w:rPr>
+      </w:pPr>
+      <w:r>
+        <w:rPr>
+          <w:lang w:val="es-ES"/>
+        </w:rPr>
+        <w:t xml:space="preserve">CU22 – Modificar participantes </w:t>
+      </w:r>
+      <w:r>
+        <w:rPr>
+          <w:lang w:val="es-ES"/>
+        </w:rPr>
+        <w:t>de la actividad</w:t>
+      </w:r>
+    </w:p>
+    <w:p>
+      <w:pPr>
+        <w:rPr>
+          <w:lang w:val="es-ES"/>
+        </w:rPr>
+      </w:pPr>
+      <w:r>
+        <w:rPr>
+          <w:lang w:val="es-ES"/>
+        </w:rPr>
+        <w:t xml:space="preserve">Añadir o eliminar socios inscritos a </w:t>
+      </w:r>
+      <w:r>
+        <w:rPr>
+          <w:lang w:val="es-ES"/>
+        </w:rPr>
+        <w:t>una actividad</w:t>
+      </w:r>
+      <w:r>
+        <w:rPr>
+          <w:lang w:val="es-ES"/>
+        </w:rPr>
+        <w:t>.</w:t>
+      </w:r>
+    </w:p>
+    <w:p>
+      <w:pPr>
+        <w:pStyle w:val="Ttulo2"/>
+        <w:rPr>
+          <w:lang w:val="es-ES"/>
+        </w:rPr>
+      </w:pPr>
+      <w:r>
+        <w:rPr>
+          <w:lang w:val="es-ES"/>
+        </w:rPr>
+        <w:t xml:space="preserve">CU23 – Listar participantes de </w:t>
+      </w:r>
+      <w:r>
+        <w:rPr>
+          <w:lang w:val="es-ES"/>
+        </w:rPr>
+        <w:t>una actividad</w:t>
+      </w:r>
+    </w:p>
+    <w:p>
+      <w:pPr>
+        <w:rPr>
+          <w:lang w:val="es-ES"/>
+        </w:rPr>
+      </w:pPr>
+      <w:r>
+        <w:rPr>
+          <w:lang w:val="es-ES"/>
+        </w:rPr>
+        <w:t>Ver el listado de socios apuntados a una actividad.</w:t>
+      </w:r>
+    </w:p>
+    <w:p>
+      <w:pPr>
+        <w:pStyle w:val="Ttulo1"/>
+        <w:rPr>
+          <w:lang w:val="es-ES"/>
+        </w:rPr>
+      </w:pPr>
+      <w:r>
+        <w:rPr>
+          <w:lang w:val="es-ES"/>
+        </w:rPr>
+        <w:t>4. Gestión de Asistencia</w:t>
+      </w:r>
+    </w:p>
+    <w:p>
+      <w:pPr>
+        <w:pStyle w:val="Ttulo2"/>
+        <w:rPr>
+          <w:lang w:val="es-ES"/>
+        </w:rPr>
+      </w:pPr>
+      <w:r>
+        <w:rPr>
+          <w:lang w:val="es-ES"/>
+        </w:rPr>
+        <w:t>CU24 – Registrar asistencia de socios</w:t>
+      </w:r>
+    </w:p>
+    <w:p>
+      <w:pPr>
+        <w:rPr>
+          <w:lang w:val="es-ES"/>
+        </w:rPr>
+      </w:pPr>
+      <w:r>
+        <w:rPr>
+          <w:lang w:val="es-ES"/>
+        </w:rPr>
+        <w:t xml:space="preserve">Marcar la presencia o ausencia de socios en sesiones </w:t>
+      </w:r>
+      <w:proofErr w:type="gramStart"/>
+      <w:r>
+        <w:rPr>
+          <w:lang w:val="es-ES"/>
+        </w:rPr>
+        <w:t xml:space="preserve">del </w:t>
+      </w:r>
+      <w:r>
+        <w:rPr>
+          <w:lang w:val="es-ES"/>
+        </w:rPr>
+        <w:t>actividad</w:t>
+      </w:r>
+      <w:proofErr w:type="gramEnd"/>
+      <w:r>
+        <w:rPr>
+          <w:lang w:val="es-ES"/>
+        </w:rPr>
+        <w:t>.</w:t>
+      </w:r>
+    </w:p>
+    <w:p>
+      <w:pPr>
+        <w:pStyle w:val="Ttulo2"/>
+        <w:rPr>
+          <w:lang w:val="es-ES"/>
+        </w:rPr>
+      </w:pPr>
+      <w:r>
+        <w:rPr>
+          <w:lang w:val="es-ES"/>
+        </w:rPr>
+        <w:t>CU25 – Modificar asistencia</w:t>
+      </w:r>
+    </w:p>
+    <w:p>
+      <w:pPr>
+        <w:rPr>
+          <w:lang w:val="es-ES"/>
+        </w:rPr>
+      </w:pPr>
+      <w:r>
+        <w:rPr>
+          <w:lang w:val="es-ES"/>
+        </w:rPr>
+        <w:t>Corregir errores en el registro de asistencia.</w:t>
+      </w:r>
+    </w:p>
+    <w:p>
+      <w:pPr>
+        <w:pStyle w:val="Ttulo2"/>
+        <w:rPr>
+          <w:lang w:val="es-ES"/>
+        </w:rPr>
+      </w:pPr>
+      <w:r>
+        <w:rPr>
+          <w:lang w:val="es-ES"/>
+        </w:rPr>
+        <w:t>CU26 – Consultar asistencia de un socio</w:t>
+      </w:r>
+    </w:p>
+    <w:p>
+      <w:pPr>
+        <w:rPr>
+          <w:lang w:val="es-ES"/>
+        </w:rPr>
+      </w:pPr>
+      <w:r>
+        <w:rPr>
+          <w:lang w:val="es-ES"/>
+        </w:rPr>
+        <w:t xml:space="preserve">Ver las asistencias del socio por </w:t>
+      </w:r>
+      <w:r>
+        <w:rPr>
+          <w:lang w:val="es-ES"/>
+        </w:rPr>
+        <w:t>actividad</w:t>
+      </w:r>
+      <w:r>
+        <w:rPr>
+          <w:lang w:val="es-ES"/>
+        </w:rPr>
+        <w:t>.</w:t>
+      </w:r>
+    </w:p>
+    <w:p>
+      <w:pPr>
+        <w:pStyle w:val="Ttulo2"/>
+        <w:rPr>
+          <w:lang w:val="es-ES"/>
+        </w:rPr>
+      </w:pPr>
+      <w:r>
+        <w:rPr>
+          <w:lang w:val="es-ES"/>
+        </w:rPr>
+        <w:t>CU27 – Generar informe de asistencia</w:t>
+      </w:r>
+    </w:p>
+    <w:p>
+      <w:pPr>
+        <w:rPr>
+          <w:lang w:val="es-ES"/>
+        </w:rPr>
+      </w:pPr>
+      <w:r>
+        <w:rPr>
+          <w:lang w:val="es-ES"/>
+        </w:rPr>
+        <w:t>Crear un informe con resumen porcentual y fechas de asistencia.</w:t>
+      </w:r>
+    </w:p>
+    <w:p>
+      <w:pPr>
+        <w:pStyle w:val="Ttulo1"/>
+        <w:rPr>
+          <w:lang w:val="es-ES"/>
+        </w:rPr>
+      </w:pPr>
+      <w:r>
+        <w:rPr>
+          <w:lang w:val="es-ES"/>
+        </w:rPr>
+        <w:t>5. Gestión de Pagos</w:t>
+      </w:r>
+      <w:r>
+        <w:rPr>
+          <w:lang w:val="es-ES"/>
+        </w:rPr>
+        <w:t xml:space="preserve"> </w:t>
+      </w:r>
+      <w:r>
+        <w:rPr>
+          <w:lang w:val="es-ES"/>
+        </w:rPr>
+        <w:t>Matrícula</w:t>
+      </w:r>
+    </w:p>
+    <w:p>
+      <w:pPr>
+        <w:pStyle w:val="Ttulo2"/>
+        <w:rPr>
+          <w:lang w:val="es-ES"/>
+        </w:rPr>
+      </w:pPr>
+      <w:r>
+        <w:rPr>
+          <w:lang w:val="es-ES"/>
+        </w:rPr>
+        <w:t>CU28 – Registrar pago</w:t>
+      </w:r>
+    </w:p>
+    <w:p>
+      <w:pPr>
+        <w:rPr>
+          <w:lang w:val="es-ES"/>
+        </w:rPr>
+      </w:pPr>
+      <w:r>
+        <w:rPr>
+          <w:lang w:val="es-ES"/>
+        </w:rPr>
+        <w:t xml:space="preserve">Registrar un pago de un socio por la inscripción a </w:t>
+      </w:r>
+      <w:r>
+        <w:rPr>
+          <w:lang w:val="es-ES"/>
+        </w:rPr>
+        <w:t>una actividad</w:t>
+      </w:r>
+      <w:r>
+        <w:rPr>
+          <w:lang w:val="es-ES"/>
+        </w:rPr>
+        <w:t>.</w:t>
+      </w:r>
+    </w:p>
+    <w:p>
+      <w:pPr>
+        <w:pStyle w:val="Ttulo2"/>
+        <w:rPr>
+          <w:lang w:val="es-ES"/>
+        </w:rPr>
+      </w:pPr>
+      <w:r>
+        <w:rPr>
+          <w:lang w:val="es-ES"/>
+        </w:rPr>
+        <w:t>CU29 – Modificar pago</w:t>
+      </w:r>
+    </w:p>
+    <w:p>
+      <w:pPr>
+        <w:rPr>
+          <w:lang w:val="es-ES"/>
+        </w:rPr>
+      </w:pPr>
+      <w:r>
+        <w:rPr>
+          <w:lang w:val="es-ES"/>
+        </w:rPr>
+        <w:t>Cambiar la cantidad, fecha u observaciones de un pago.</w:t>
+      </w:r>
+    </w:p>
+    <w:p>
+      <w:pPr>
+        <w:pStyle w:val="Ttulo2"/>
+        <w:rPr>
+          <w:lang w:val="es-ES"/>
+        </w:rPr>
+      </w:pPr>
+      <w:r>
+        <w:rPr>
+          <w:lang w:val="es-ES"/>
+        </w:rPr>
+        <w:t>CU30 – Eliminar pago</w:t>
+      </w:r>
+    </w:p>
+    <w:p>
+      <w:pPr>
+        <w:rPr>
+          <w:lang w:val="es-ES"/>
+        </w:rPr>
+      </w:pPr>
+      <w:r>
+        <w:rPr>
+          <w:lang w:val="es-ES"/>
+        </w:rPr>
+        <w:t>Eliminar un registro de pago.</w:t>
+      </w:r>
+    </w:p>
+    <w:p>
+      <w:pPr>
+        <w:pStyle w:val="Ttulo2"/>
+        <w:rPr>
+          <w:lang w:val="es-ES"/>
+        </w:rPr>
+      </w:pPr>
+      <w:r>
+        <w:rPr>
+          <w:lang w:val="es-ES"/>
+        </w:rPr>
+        <w:t>CU31 – Consultar pagos de un socio</w:t>
+      </w:r>
+    </w:p>
+    <w:p>
+      <w:pPr>
+        <w:rPr>
+          <w:lang w:val="es-ES"/>
+        </w:rPr>
+      </w:pPr>
+      <w:r>
+        <w:rPr>
+          <w:lang w:val="es-ES"/>
+        </w:rPr>
+        <w:t>Ver todos los pagos realizados por un socio.</w:t>
+      </w:r>
+    </w:p>
+    <w:p>
+      <w:pPr>
+        <w:pStyle w:val="Ttulo2"/>
+        <w:rPr>
+          <w:lang w:val="es-ES"/>
+        </w:rPr>
+      </w:pPr>
+      <w:r>
+        <w:rPr>
+          <w:lang w:val="es-ES"/>
+        </w:rPr>
+        <w:lastRenderedPageBreak/>
+        <w:t>CU32 – Consultar pagos de una actividad</w:t>
+      </w:r>
+    </w:p>
+    <w:p>
+      <w:pPr>
+        <w:rPr>
+          <w:lang w:val="es-ES"/>
+        </w:rPr>
+      </w:pPr>
+      <w:r>
+        <w:rPr>
+          <w:lang w:val="es-ES"/>
+        </w:rPr>
+        <w:t xml:space="preserve">Ver los pagos recibidos para </w:t>
+      </w:r>
+      <w:r>
+        <w:rPr>
+          <w:lang w:val="es-ES"/>
+        </w:rPr>
+        <w:t>una actividad</w:t>
+      </w:r>
+      <w:r>
+        <w:rPr>
+          <w:lang w:val="es-ES"/>
+        </w:rPr>
+        <w:t xml:space="preserve"> </w:t>
+      </w:r>
+      <w:r>
+        <w:rPr>
+          <w:lang w:val="es-ES"/>
+        </w:rPr>
+        <w:t>específica</w:t>
+      </w:r>
+      <w:r>
+        <w:rPr>
+          <w:lang w:val="es-ES"/>
+        </w:rPr>
+        <w:t>.</w:t>
+      </w:r>
+    </w:p>
+    <w:p>
+      <w:pPr>
+        <w:pStyle w:val="Ttulo1"/>
+        <w:rPr>
+          <w:lang w:val="es-ES"/>
+        </w:rPr>
+      </w:pPr>
+      <w:r>
+        <w:rPr>
+          <w:lang w:val="es-ES"/>
+        </w:rPr>
+        <w:t>6. Gestión de Curso Académico</w:t>
+      </w:r>
+    </w:p>
+    <w:p>
+      <w:pPr>
+        <w:pStyle w:val="Ttulo2"/>
+        <w:rPr>
+          <w:lang w:val="es-ES"/>
+        </w:rPr>
+      </w:pPr>
+      <w:r>
+        <w:rPr>
+          <w:lang w:val="es-ES"/>
+        </w:rPr>
+        <w:t>CU33 – Crear curso académico</w:t>
+      </w:r>
+    </w:p>
+    <w:p>
+      <w:pPr>
+        <w:rPr>
+          <w:lang w:val="es-ES"/>
+        </w:rPr>
+      </w:pPr>
+      <w:r>
+        <w:rPr>
+          <w:lang w:val="es-ES"/>
+        </w:rPr>
+        <w:t>Formato 24/25 por ejemplo</w:t>
+      </w:r>
+    </w:p>
+    <w:p>
+      <w:pPr>
+        <w:pStyle w:val="Ttulo2"/>
+        <w:rPr>
+          <w:lang w:val="es-ES"/>
+        </w:rPr>
+      </w:pPr>
+      <w:r>
+        <w:rPr>
+          <w:lang w:val="es-ES"/>
+        </w:rPr>
+        <w:t>CU34 – Crear Trimestres por curso académico</w:t>
+      </w:r>
+    </w:p>
+    <w:p>
+      <w:pPr>
+        <w:rPr>
+          <w:lang w:val="es-ES"/>
+        </w:rPr>
+      </w:pPr>
+      <w:r>
+        <w:rPr>
+          <w:lang w:val="es-ES"/>
+        </w:rPr>
+        <w:t>Crear 4 trimestres en un curso académico</w:t>
+      </w:r>
+    </w:p>
+    <w:p>
+      <w:pPr>
+        <w:pStyle w:val="Ttulo1"/>
+        <w:rPr>
+          <w:lang w:val="es-ES"/>
+        </w:rPr>
+      </w:pPr>
+      <w:r>
+        <w:rPr>
+          <w:lang w:val="es-ES"/>
+        </w:rPr>
+        <w:t>6. Importación y Exportación</w:t>
+      </w:r>
+    </w:p>
+    <w:p>
+      <w:pPr>
+        <w:pStyle w:val="Ttulo2"/>
+        <w:rPr>
+          <w:lang w:val="es-ES"/>
+        </w:rPr>
+      </w:pPr>
+      <w:r>
+        <w:rPr>
+          <w:lang w:val="es-ES"/>
+        </w:rPr>
+        <w:t>CU3</w:t>
+      </w:r>
+      <w:r>
+        <w:rPr>
+          <w:lang w:val="es-ES"/>
+        </w:rPr>
+        <w:t>5</w:t>
+      </w:r>
+      <w:r>
+        <w:rPr>
+          <w:lang w:val="es-ES"/>
+        </w:rPr>
+        <w:t xml:space="preserve"> – </w:t>
+      </w:r>
+      <w:bookmarkStart w:id="2" w:name="OLE_LINK5"/>
+      <w:bookmarkStart w:id="3" w:name="OLE_LINK6"/>
+      <w:r>
+        <w:rPr>
+          <w:lang w:val="es-ES"/>
+        </w:rPr>
+        <w:t xml:space="preserve">Importar datos </w:t>
+      </w:r>
+      <w:r>
+        <w:rPr>
+          <w:lang w:val="es-ES"/>
+        </w:rPr>
+        <w:t xml:space="preserve">de socios </w:t>
+      </w:r>
+      <w:r>
+        <w:rPr>
+          <w:lang w:val="es-ES"/>
+        </w:rPr>
+        <w:t>desde Excel</w:t>
+      </w:r>
+    </w:p>
+    <w:p>
+      <w:pPr>
+        <w:rPr>
+          <w:lang w:val="es-ES"/>
+        </w:rPr>
+      </w:pPr>
+      <w:r>
+        <w:rPr>
+          <w:lang w:val="es-ES"/>
+        </w:rPr>
+        <w:t>Cargar socios, voluntarios</w:t>
+      </w:r>
+      <w:r>
+        <w:rPr>
+          <w:lang w:val="es-ES"/>
+        </w:rPr>
+        <w:t>, profesores</w:t>
+      </w:r>
+      <w:r>
+        <w:rPr>
+          <w:lang w:val="es-ES"/>
+        </w:rPr>
+        <w:t xml:space="preserve"> o </w:t>
+      </w:r>
+      <w:r>
+        <w:rPr>
+          <w:lang w:val="es-ES"/>
+        </w:rPr>
+        <w:t>actividades</w:t>
+      </w:r>
+      <w:r>
+        <w:rPr>
+          <w:lang w:val="es-ES"/>
+        </w:rPr>
+        <w:t xml:space="preserve"> desde archivo Excel.</w:t>
       </w:r>
     </w:p>
     <w:bookmarkEnd w:id="2"/>
+    <w:bookmarkEnd w:id="3"/>
     <w:p>
       <w:pPr>
-        <w:pStyle w:val="Ttulo1"/>
-        <w:rPr>
-          <w:lang w:val="es-ES"/>
-        </w:rPr>
-      </w:pPr>
-      <w:r>
-        <w:rPr>
-          <w:lang w:val="es-ES"/>
-        </w:rPr>
-        <w:t>8. Gestión de Acceso</w:t>
+        <w:pStyle w:val="Ttulo2"/>
+        <w:rPr>
+          <w:lang w:val="es-ES"/>
+        </w:rPr>
+      </w:pPr>
+      <w:r>
+        <w:rPr>
+          <w:lang w:val="es-ES"/>
+        </w:rPr>
+        <w:t>CU3</w:t>
+      </w:r>
+      <w:r>
+        <w:rPr>
+          <w:lang w:val="es-ES"/>
+        </w:rPr>
+        <w:t>6</w:t>
+      </w:r>
+      <w:r>
+        <w:rPr>
+          <w:lang w:val="es-ES"/>
+        </w:rPr>
+        <w:t xml:space="preserve"> - </w:t>
+      </w:r>
+      <w:r>
+        <w:rPr>
+          <w:lang w:val="es-ES"/>
+        </w:rPr>
+        <w:t xml:space="preserve">Importar datos </w:t>
+      </w:r>
+      <w:r>
+        <w:rPr>
+          <w:lang w:val="es-ES"/>
+        </w:rPr>
+        <w:t xml:space="preserve">de </w:t>
+      </w:r>
+      <w:r>
+        <w:rPr>
+          <w:lang w:val="es-ES"/>
+        </w:rPr>
+        <w:t>voluntarios y profesores</w:t>
+      </w:r>
+      <w:r>
+        <w:rPr>
+          <w:lang w:val="es-ES"/>
+        </w:rPr>
+        <w:t xml:space="preserve"> </w:t>
+      </w:r>
+      <w:r>
+        <w:rPr>
+          <w:lang w:val="es-ES"/>
+        </w:rPr>
+        <w:t>desde Excel</w:t>
       </w:r>
     </w:p>
     <w:p>
       <w:pPr>
-        <w:pStyle w:val="Ttulo2"/>
-        <w:rPr>
-          <w:lang w:val="es-ES"/>
-        </w:rPr>
-      </w:pPr>
-      <w:r>
-        <w:rPr>
-          <w:lang w:val="es-ES"/>
-        </w:rPr>
-        <w:t>CU4</w:t>
-      </w:r>
-      <w:r>
-        <w:rPr>
-          <w:lang w:val="es-ES"/>
-        </w:rPr>
-        <w:t>1</w:t>
-      </w:r>
-      <w:r>
-        <w:rPr>
-          <w:lang w:val="es-ES"/>
-        </w:rPr>
-        <w:t xml:space="preserve"> – Iniciar sesión</w:t>
+        <w:rPr>
+          <w:lang w:val="es-ES"/>
+        </w:rPr>
+      </w:pPr>
+      <w:r>
+        <w:rPr>
+          <w:lang w:val="es-ES"/>
+        </w:rPr>
+        <w:t>Cargar voluntarios</w:t>
+      </w:r>
+      <w:r>
+        <w:rPr>
+          <w:lang w:val="es-ES"/>
+        </w:rPr>
+        <w:t xml:space="preserve"> y</w:t>
+      </w:r>
+      <w:r>
+        <w:rPr>
+          <w:lang w:val="es-ES"/>
+        </w:rPr>
+        <w:t xml:space="preserve"> profesores</w:t>
+      </w:r>
+      <w:r>
+        <w:rPr>
+          <w:lang w:val="es-ES"/>
+        </w:rPr>
+        <w:t xml:space="preserve"> desde archivo Excel.</w:t>
       </w:r>
     </w:p>
     <w:p>
       <w:pPr>
-        <w:rPr>
-          <w:lang w:val="es-ES"/>
-        </w:rPr>
-      </w:pPr>
-      <w:r>
-        <w:rPr>
-          <w:lang w:val="es-ES"/>
-        </w:rPr>
-        <w:t>El administrador se autentica en el sistema.</w:t>
+        <w:pStyle w:val="Ttulo2"/>
+        <w:rPr>
+          <w:lang w:val="es-ES"/>
+        </w:rPr>
+      </w:pPr>
+      <w:r>
+        <w:rPr>
+          <w:lang w:val="es-ES"/>
+        </w:rPr>
+        <w:t>CU3</w:t>
+      </w:r>
+      <w:r>
+        <w:rPr>
+          <w:lang w:val="es-ES"/>
+        </w:rPr>
+        <w:t>7</w:t>
+      </w:r>
+      <w:r>
+        <w:rPr>
+          <w:lang w:val="es-ES"/>
+        </w:rPr>
+        <w:t xml:space="preserve"> - </w:t>
+      </w:r>
+      <w:r>
+        <w:rPr>
+          <w:lang w:val="es-ES"/>
+        </w:rPr>
+        <w:t xml:space="preserve">Importar datos </w:t>
+      </w:r>
+      <w:r>
+        <w:rPr>
+          <w:lang w:val="es-ES"/>
+        </w:rPr>
+        <w:t xml:space="preserve">de </w:t>
+      </w:r>
+      <w:r>
+        <w:rPr>
+          <w:lang w:val="es-ES"/>
+        </w:rPr>
+        <w:t>actividades</w:t>
+      </w:r>
+      <w:r>
+        <w:rPr>
+          <w:lang w:val="es-ES"/>
+        </w:rPr>
+        <w:t xml:space="preserve"> </w:t>
+      </w:r>
+      <w:r>
+        <w:rPr>
+          <w:lang w:val="es-ES"/>
+        </w:rPr>
+        <w:t>desde Excel</w:t>
       </w:r>
     </w:p>
     <w:p>
       <w:pPr>
-        <w:pStyle w:val="Ttulo2"/>
-        <w:rPr>
-          <w:lang w:val="es-ES"/>
-        </w:rPr>
-      </w:pPr>
-      <w:r>
-        <w:rPr>
-          <w:lang w:val="es-ES"/>
-        </w:rPr>
-        <w:t>CU4</w:t>
-      </w:r>
-      <w:r>
-        <w:rPr>
-          <w:lang w:val="es-ES"/>
-        </w:rPr>
-        <w:t>2</w:t>
-      </w:r>
-      <w:r>
-        <w:rPr>
-          <w:lang w:val="es-ES"/>
-        </w:rPr>
-        <w:t xml:space="preserve"> – Cerrar sesión</w:t>
+        <w:rPr>
+          <w:lang w:val="es-ES"/>
+        </w:rPr>
+      </w:pPr>
+      <w:r>
+        <w:rPr>
+          <w:lang w:val="es-ES"/>
+        </w:rPr>
+        <w:t xml:space="preserve">Cargar </w:t>
+      </w:r>
+      <w:r>
+        <w:rPr>
+          <w:lang w:val="es-ES"/>
+        </w:rPr>
+        <w:t xml:space="preserve">actividades </w:t>
+      </w:r>
+      <w:r>
+        <w:rPr>
+          <w:lang w:val="es-ES"/>
+        </w:rPr>
+        <w:t>desde archivo Excel.</w:t>
       </w:r>
     </w:p>
     <w:p>
       <w:pPr>
-        <w:rPr>
-          <w:lang w:val="es-ES"/>
-        </w:rPr>
-      </w:pPr>
-      <w:r>
-        <w:rPr>
-          <w:lang w:val="es-ES"/>
-        </w:rPr>
-        <w:t>Finaliza su sesión actual.</w:t>
+        <w:pStyle w:val="Ttulo1"/>
+        <w:rPr>
+          <w:lang w:val="es-ES"/>
+        </w:rPr>
+      </w:pPr>
+      <w:r>
+        <w:rPr>
+          <w:lang w:val="es-ES"/>
+        </w:rPr>
+        <w:t>7. Generación de Informes</w:t>
       </w:r>
     </w:p>
     <w:p>
@@ -1338,6 +2036,247 @@
         <w:rPr>
           <w:lang w:val="es-ES"/>
         </w:rPr>
+        <w:t>CU3</w:t>
+      </w:r>
+      <w:r>
+        <w:rPr>
+          <w:lang w:val="es-ES"/>
+        </w:rPr>
+        <w:t>8</w:t>
+      </w:r>
+      <w:r>
+        <w:rPr>
+          <w:lang w:val="es-ES"/>
+        </w:rPr>
+        <w:t xml:space="preserve"> – Generar informe de socios</w:t>
+      </w:r>
+    </w:p>
+    <w:p>
+      <w:pPr>
+        <w:rPr>
+          <w:lang w:val="es-ES"/>
+        </w:rPr>
+      </w:pPr>
+      <w:r>
+        <w:rPr>
+          <w:lang w:val="es-ES"/>
+        </w:rPr>
+        <w:t>Exportar todos los datos de socios activos o dados de baja.</w:t>
+      </w:r>
+    </w:p>
+    <w:p>
+      <w:pPr>
+        <w:pStyle w:val="Ttulo2"/>
+        <w:rPr>
+          <w:lang w:val="es-ES"/>
+        </w:rPr>
+      </w:pPr>
+      <w:r>
+        <w:rPr>
+          <w:lang w:val="es-ES"/>
+        </w:rPr>
+        <w:t>CU3</w:t>
+      </w:r>
+      <w:r>
+        <w:rPr>
+          <w:lang w:val="es-ES"/>
+        </w:rPr>
+        <w:t>9</w:t>
+      </w:r>
+      <w:r>
+        <w:rPr>
+          <w:lang w:val="es-ES"/>
+        </w:rPr>
+        <w:t xml:space="preserve"> – Generar informe de actividades</w:t>
+      </w:r>
+    </w:p>
+    <w:p>
+      <w:pPr>
+        <w:rPr>
+          <w:lang w:val="es-ES"/>
+        </w:rPr>
+      </w:pPr>
+      <w:r>
+        <w:rPr>
+          <w:lang w:val="es-ES"/>
+        </w:rPr>
+        <w:t xml:space="preserve">Listado general de </w:t>
+      </w:r>
+      <w:bookmarkStart w:id="4" w:name="OLE_LINK7"/>
+      <w:bookmarkStart w:id="5" w:name="OLE_LINK8"/>
+      <w:r>
+        <w:rPr>
+          <w:lang w:val="es-ES"/>
+        </w:rPr>
+        <w:t>actividades</w:t>
+      </w:r>
+      <w:r>
+        <w:rPr>
+          <w:lang w:val="es-ES"/>
+        </w:rPr>
+        <w:t xml:space="preserve"> </w:t>
+      </w:r>
+      <w:bookmarkEnd w:id="4"/>
+      <w:bookmarkEnd w:id="5"/>
+      <w:r>
+        <w:rPr>
+          <w:lang w:val="es-ES"/>
+        </w:rPr>
+        <w:t>activos y su información.</w:t>
+      </w:r>
+    </w:p>
+    <w:p>
+      <w:pPr>
+        <w:pStyle w:val="Ttulo2"/>
+        <w:rPr>
+          <w:lang w:val="es-ES"/>
+        </w:rPr>
+      </w:pPr>
+      <w:r>
+        <w:rPr>
+          <w:lang w:val="es-ES"/>
+        </w:rPr>
+        <w:t>CU</w:t>
+      </w:r>
+      <w:r>
+        <w:rPr>
+          <w:lang w:val="es-ES"/>
+        </w:rPr>
+        <w:t>40</w:t>
+      </w:r>
+      <w:r>
+        <w:rPr>
+          <w:lang w:val="es-ES"/>
+        </w:rPr>
+        <w:t xml:space="preserve"> – Generar informe de profesores</w:t>
+      </w:r>
+    </w:p>
+    <w:p>
+      <w:pPr>
+        <w:rPr>
+          <w:lang w:val="es-ES"/>
+        </w:rPr>
+      </w:pPr>
+      <w:r>
+        <w:rPr>
+          <w:lang w:val="es-ES"/>
+        </w:rPr>
+        <w:t>Ver resumen de voluntarios y sus actividades impartidas.</w:t>
+      </w:r>
+    </w:p>
+    <w:p>
+      <w:pPr>
+        <w:pStyle w:val="Ttulo2"/>
+        <w:rPr>
+          <w:lang w:val="es-ES"/>
+        </w:rPr>
+      </w:pPr>
+      <w:bookmarkStart w:id="6" w:name="_Hlk201490768"/>
+      <w:bookmarkStart w:id="7" w:name="OLE_LINK2"/>
+      <w:r>
+        <w:rPr>
+          <w:lang w:val="es-ES"/>
+        </w:rPr>
+        <w:t>CU</w:t>
+      </w:r>
+      <w:r>
+        <w:rPr>
+          <w:lang w:val="es-ES"/>
+        </w:rPr>
+        <w:t>41</w:t>
+      </w:r>
+      <w:r>
+        <w:rPr>
+          <w:lang w:val="es-ES"/>
+        </w:rPr>
+        <w:t xml:space="preserve"> – Generar informe de inscripciones</w:t>
+      </w:r>
+    </w:p>
+    <w:bookmarkEnd w:id="6"/>
+    <w:bookmarkEnd w:id="7"/>
+    <w:p>
+      <w:pPr>
+        <w:rPr>
+          <w:lang w:val="es-ES"/>
+        </w:rPr>
+      </w:pPr>
+      <w:r>
+        <w:rPr>
+          <w:lang w:val="es-ES"/>
+        </w:rPr>
+        <w:t xml:space="preserve">Ver qué socios están inscritos en qué </w:t>
+      </w:r>
+      <w:r>
+        <w:rPr>
+          <w:lang w:val="es-ES"/>
+        </w:rPr>
+        <w:t>actividades</w:t>
+      </w:r>
+      <w:r>
+        <w:rPr>
+          <w:lang w:val="es-ES"/>
+        </w:rPr>
+        <w:t>.</w:t>
+      </w:r>
+      <w:r>
+        <w:rPr>
+          <w:lang w:val="es-ES"/>
+        </w:rPr>
+        <w:t xml:space="preserve"> Dar opción a ordenar por fecha de inscripción.</w:t>
+      </w:r>
+    </w:p>
+    <w:p>
+      <w:pPr>
+        <w:pStyle w:val="Ttulo2"/>
+        <w:rPr>
+          <w:lang w:val="es-ES"/>
+        </w:rPr>
+      </w:pPr>
+      <w:r>
+        <w:rPr>
+          <w:lang w:val="es-ES"/>
+        </w:rPr>
+        <w:t>CU</w:t>
+      </w:r>
+      <w:r>
+        <w:rPr>
+          <w:lang w:val="es-ES"/>
+        </w:rPr>
+        <w:t>42</w:t>
+      </w:r>
+      <w:r>
+        <w:rPr>
+          <w:lang w:val="es-ES"/>
+        </w:rPr>
+        <w:t xml:space="preserve"> – Generar informe de pagos</w:t>
+      </w:r>
+    </w:p>
+    <w:p>
+      <w:pPr>
+        <w:rPr>
+          <w:lang w:val="es-ES"/>
+        </w:rPr>
+      </w:pPr>
+      <w:r>
+        <w:rPr>
+          <w:lang w:val="es-ES"/>
+        </w:rPr>
+        <w:t>Ver pagos realizados por curso, socio o fecha.</w:t>
+      </w:r>
+    </w:p>
+    <w:p>
+      <w:pPr>
+        <w:pStyle w:val="Ttulo2"/>
+        <w:rPr>
+          <w:lang w:val="es-ES"/>
+        </w:rPr>
+      </w:pPr>
+      <w:bookmarkStart w:id="8" w:name="OLE_LINK1"/>
+      <w:r>
+        <w:rPr>
+          <w:lang w:val="es-ES"/>
+        </w:rPr>
+        <w:lastRenderedPageBreak/>
         <w:t>CU4</w:t>
       </w:r>
       <w:r>
@@ -1345,6 +2284,150 @@
           <w:lang w:val="es-ES"/>
         </w:rPr>
         <w:t>3</w:t>
+      </w:r>
+      <w:r>
+        <w:rPr>
+          <w:lang w:val="es-ES"/>
+        </w:rPr>
+        <w:t xml:space="preserve"> – Generar informe de </w:t>
+      </w:r>
+      <w:r>
+        <w:rPr>
+          <w:lang w:val="es-ES"/>
+        </w:rPr>
+        <w:t>asistencia trimestral</w:t>
+      </w:r>
+    </w:p>
+    <w:p>
+      <w:pPr>
+        <w:rPr>
+          <w:lang w:val="es-ES"/>
+        </w:rPr>
+      </w:pPr>
+      <w:r>
+        <w:rPr>
+          <w:lang w:val="es-ES"/>
+        </w:rPr>
+        <w:t>Por cada actividad, poder generar un informe de asistencia trimestral</w:t>
+      </w:r>
+      <w:r>
+        <w:rPr>
+          <w:lang w:val="es-ES"/>
+        </w:rPr>
+        <w:t xml:space="preserve"> de cada alumno.</w:t>
+      </w:r>
+    </w:p>
+    <w:bookmarkEnd w:id="8"/>
+    <w:p>
+      <w:pPr>
+        <w:pStyle w:val="Ttulo1"/>
+        <w:rPr>
+          <w:lang w:val="es-ES"/>
+        </w:rPr>
+      </w:pPr>
+      <w:r>
+        <w:rPr>
+          <w:lang w:val="es-ES"/>
+        </w:rPr>
+        <w:t>8. Gestión de Acceso</w:t>
+      </w:r>
+    </w:p>
+    <w:p>
+      <w:pPr>
+        <w:pStyle w:val="Ttulo2"/>
+        <w:rPr>
+          <w:lang w:val="es-ES"/>
+        </w:rPr>
+      </w:pPr>
+      <w:r>
+        <w:rPr>
+          <w:lang w:val="es-ES"/>
+        </w:rPr>
+        <w:t>CU4</w:t>
+      </w:r>
+      <w:r>
+        <w:rPr>
+          <w:lang w:val="es-ES"/>
+        </w:rPr>
+        <w:t>4</w:t>
+      </w:r>
+      <w:r>
+        <w:rPr>
+          <w:lang w:val="es-ES"/>
+        </w:rPr>
+        <w:t xml:space="preserve"> – Iniciar sesión</w:t>
+      </w:r>
+    </w:p>
+    <w:p>
+      <w:pPr>
+        <w:rPr>
+          <w:lang w:val="es-ES"/>
+        </w:rPr>
+      </w:pPr>
+      <w:r>
+        <w:rPr>
+          <w:lang w:val="es-ES"/>
+        </w:rPr>
+        <w:t>El administrador se autentica en el sistema.</w:t>
+      </w:r>
+    </w:p>
+    <w:p>
+      <w:pPr>
+        <w:pStyle w:val="Ttulo2"/>
+        <w:rPr>
+          <w:lang w:val="es-ES"/>
+        </w:rPr>
+      </w:pPr>
+      <w:r>
+        <w:rPr>
+          <w:lang w:val="es-ES"/>
+        </w:rPr>
+        <w:t>CU4</w:t>
+      </w:r>
+      <w:r>
+        <w:rPr>
+          <w:lang w:val="es-ES"/>
+        </w:rPr>
+        <w:t>5</w:t>
+      </w:r>
+      <w:r>
+        <w:rPr>
+          <w:lang w:val="es-ES"/>
+        </w:rPr>
+        <w:t xml:space="preserve"> – Cerrar sesión</w:t>
+      </w:r>
+    </w:p>
+    <w:p>
+      <w:pPr>
+        <w:rPr>
+          <w:lang w:val="es-ES"/>
+        </w:rPr>
+      </w:pPr>
+      <w:r>
+        <w:rPr>
+          <w:lang w:val="es-ES"/>
+        </w:rPr>
+        <w:t>Finaliza su sesión actual.</w:t>
+      </w:r>
+    </w:p>
+    <w:p>
+      <w:pPr>
+        <w:pStyle w:val="Ttulo2"/>
+        <w:rPr>
+          <w:lang w:val="es-ES"/>
+        </w:rPr>
+      </w:pPr>
+      <w:r>
+        <w:rPr>
+          <w:lang w:val="es-ES"/>
+        </w:rPr>
+        <w:t>CU4</w:t>
+      </w:r>
+      <w:r>
+        <w:rPr>
+          <w:lang w:val="es-ES"/>
+        </w:rPr>
+        <w:t>6</w:t>
       </w:r>
       <w:r>
         <w:rPr>

</xml_diff>